<commit_message>
Prepare JAS for Streamlit deployment
</commit_message>
<xml_diff>
--- a/templates/loa/elkolind/v1/LoA Elkolind-2026.docx
+++ b/templates/loa/elkolind/v1/LoA Elkolind-2026.docx
@@ -1,6 +1,6 @@
 
 <file path=word/document.xml><?xml version="1.0" encoding="utf-8"?>
-<w:document xmlns:wpc="http://schemas.microsoft.com/office/word/2010/wordprocessingCanvas" xmlns:mc="http://schemas.openxmlformats.org/markup-compatibility/2006" xmlns:o="urn:schemas-microsoft-com:office:office" xmlns:r="http://schemas.openxmlformats.org/officeDocument/2006/relationships" xmlns:m="http://schemas.openxmlformats.org/officeDocument/2006/math" xmlns:v="urn:schemas-microsoft-com:vml" xmlns:wp14="http://schemas.microsoft.com/office/word/2010/wordprocessingDrawing" xmlns:wp="http://schemas.openxmlformats.org/drawingml/2006/wordprocessingDrawing" xmlns:w="http://schemas.openxmlformats.org/wordprocessingml/2006/main" xmlns:w14="http://schemas.microsoft.com/office/word/2010/wordml" xmlns:w10="urn:schemas-microsoft-com:office:word" xmlns:w15="http://schemas.microsoft.com/office/word/2012/wordml" xmlns:wpg="http://schemas.microsoft.com/office/word/2010/wordprocessingGroup" xmlns:wpi="http://schemas.microsoft.com/office/word/2010/wordprocessingInk" xmlns:wne="http://schemas.microsoft.com/office/word/2006/wordml" xmlns:wps="http://schemas.microsoft.com/office/word/2010/wordprocessingShape" xmlns:wpsCustomData="http://www.wps.cn/officeDocument/2013/wpsCustomData" mc:Ignorable="w14 w15 wp14">
+<w:document xmlns:wpc="http://schemas.microsoft.com/office/word/2010/wordprocessingCanvas" xmlns:cx="http://schemas.microsoft.com/office/drawing/2014/chartex" xmlns:cx1="http://schemas.microsoft.com/office/drawing/2015/9/8/chartex" xmlns:cx2="http://schemas.microsoft.com/office/drawing/2015/10/21/chartex" xmlns:cx3="http://schemas.microsoft.com/office/drawing/2016/5/9/chartex" xmlns:cx4="http://schemas.microsoft.com/office/drawing/2016/5/10/chartex" xmlns:cx5="http://schemas.microsoft.com/office/drawing/2016/5/11/chartex" xmlns:cx6="http://schemas.microsoft.com/office/drawing/2016/5/12/chartex" xmlns:cx7="http://schemas.microsoft.com/office/drawing/2016/5/13/chartex" xmlns:cx8="http://schemas.microsoft.com/office/drawing/2016/5/14/chartex" xmlns:mc="http://schemas.openxmlformats.org/markup-compatibility/2006" xmlns:o="urn:schemas-microsoft-com:office:office" xmlns:r="http://schemas.openxmlformats.org/officeDocument/2006/relationships" xmlns:m="http://schemas.openxmlformats.org/officeDocument/2006/math" xmlns:v="urn:schemas-microsoft-com:vml" xmlns:wp14="http://schemas.microsoft.com/office/word/2010/wordprocessingDrawing" xmlns:wp="http://schemas.openxmlformats.org/drawingml/2006/wordprocessingDrawing" xmlns:w="http://schemas.openxmlformats.org/wordprocessingml/2006/main" xmlns:w14="http://schemas.microsoft.com/office/word/2010/wordml" xmlns:w10="urn:schemas-microsoft-com:office:word" xmlns:w15="http://schemas.microsoft.com/office/word/2012/wordml" xmlns:wpg="http://schemas.microsoft.com/office/word/2010/wordprocessingGroup" xmlns:wpi="http://schemas.microsoft.com/office/word/2010/wordprocessingInk" xmlns:wne="http://schemas.microsoft.com/office/word/2006/wordml" xmlns:wps="http://schemas.microsoft.com/office/word/2010/wordprocessingShape" xmlns:wpsCustomData="http://www.wps.cn/officeDocument/2013/wpsCustomData" mc:Ignorable="w14 w15 wp14">
   <w:body>
     <w:p>
       <w:pPr>
@@ -117,34 +117,6 @@
         </w:rPr>
         <w:t xml:space="preserve"> {{loa_number}}</w:t>
       </w:r>
-      <w:r>
-        <w:rPr>
-          <w:rFonts w:hint="default"/>
-          <w:spacing w:val="-2"/>
-          <w:lang w:val="en-US"/>
-        </w:rPr>
-        <w:t/>
-      </w:r>
-      <w:r>
-        <w:rPr>
-          <w:spacing w:val="-2"/>
-        </w:rPr>
-        <w:t/>
-      </w:r>
-      <w:r>
-        <w:rPr>
-          <w:rFonts w:hint="default"/>
-          <w:spacing w:val="-2"/>
-          <w:lang w:val="en-US"/>
-        </w:rPr>
-        <w:t/>
-      </w:r>
-      <w:r>
-        <w:rPr>
-          <w:spacing w:val="-2"/>
-        </w:rPr>
-        <w:t/>
-      </w:r>
     </w:p>
     <w:p>
       <w:pPr>
@@ -392,6 +364,13 @@
           <w:lang w:val="en-US"/>
         </w:rPr>
         <w:tab/>
+      </w:r>
+      <w:r>
+        <w:rPr>
+          <w:rFonts w:hint="default"/>
+          <w:spacing w:val="-5"/>
+          <w:lang w:val="en-US"/>
+        </w:rPr>
         <w:t xml:space="preserve">: </w:t>
       </w:r>
       <w:r>
@@ -590,16 +569,7 @@
         <w:t xml:space="preserve"> </w:t>
       </w:r>
       <w:r>
-        <w:t>Tahun {{publication_year}}</w:t>
-      </w:r>
-      <w:r>
-        <w:rPr>
-          <w:spacing w:val="-4"/>
-        </w:rPr>
-        <w:t xml:space="preserve"/>
-      </w:r>
-      <w:r>
-        <w:t xml:space="preserve">), dan akan kami terbitkan secara online pada URL berikut : </w:t>
+        <w:t xml:space="preserve">Tahun {{publication_year}}), dan akan kami terbitkan secara online pada URL berikut : </w:t>
       </w:r>
       <w:r>
         <w:fldChar w:fldCharType="begin"/>
@@ -673,7 +643,7 @@
         <mc:AlternateContent>
           <mc:Choice Requires="wpg">
             <w:drawing>
-              <wp:anchor distT="0" distB="0" distL="0" distR="0" simplePos="0" relativeHeight="251661312" behindDoc="1" locked="0" layoutInCell="1" allowOverlap="1">
+              <wp:anchor distT="0" distB="0" distL="0" distR="0" simplePos="0" relativeHeight="251660288" behindDoc="1" locked="0" layoutInCell="1" allowOverlap="1">
                 <wp:simplePos x="0" y="0"/>
                 <wp:positionH relativeFrom="page">
                   <wp:posOffset>4250055</wp:posOffset>
@@ -877,7 +847,7 @@
           </mc:Choice>
           <mc:Fallback>
             <w:pict>
-              <v:group id="_x0000_s1026" o:spid="_x0000_s1026" o:spt="203" style="position:absolute;left:0pt;margin-left:334.65pt;margin-top:14.3pt;height:109.9pt;width:153.8pt;mso-position-horizontal-relative:page;mso-wrap-distance-bottom:0pt;mso-wrap-distance-top:0pt;z-index:-251655168;mso-width-relative:page;mso-height-relative:page;" coordsize="1953260,1395730" o:gfxdata="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">
+              <v:group id="_x0000_s1026" o:spid="_x0000_s1026" o:spt="203" style="position:absolute;left:0pt;margin-left:334.65pt;margin-top:14.3pt;height:109.9pt;width:153.8pt;mso-position-horizontal-relative:page;mso-wrap-distance-bottom:0pt;mso-wrap-distance-top:0pt;z-index:-251656192;mso-width-relative:page;mso-height-relative:page;" coordsize="1953260,1395730" o:gfxdata="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">
                 <o:lock v:ext="edit" aspectratio="f"/>
                 <v:shape id="Textbox 3" o:spid="_x0000_s1026" o:spt="202" type="#_x0000_t202" style="position:absolute;left:0;top:0;height:168910;width:1904364;" filled="f" stroked="f" coordsize="21600,21600" o:gfxdata="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">
                   <v:fill on="f" focussize="0,0"/>
@@ -1037,29 +1007,61 @@
         </mc:AlternateContent>
       </w:r>
       <w:r>
+        <w:t>Malang,</w:t>
+      </w:r>
+      <w:r>
+        <w:rPr>
+          <w:spacing w:val="-2"/>
+        </w:rPr>
+        <w:t xml:space="preserve"> </w:t>
+      </w:r>
+      <w:r>
+        <w:rPr>
+          <w:rFonts w:hint="default"/>
+          <w:lang w:val="en-US"/>
+        </w:rPr>
+        <w:t>{{loa_date}}</w:t>
+      </w:r>
+    </w:p>
+    <w:p>
+      <w:pPr>
+        <w:pStyle w:val="6"/>
+        <w:rPr>
+          <w:sz w:val="20"/>
+        </w:rPr>
+      </w:pPr>
+      <w:r>
+        <w:rPr>
+          <w:lang w:eastAsia="en-US"/>
+        </w:rPr>
         <w:drawing>
-          <wp:anchor distT="0" distB="0" distL="0" distR="0" simplePos="0" relativeHeight="251660288" behindDoc="0" locked="0" layoutInCell="1" allowOverlap="1">
+          <wp:anchor distT="0" distB="0" distL="114300" distR="114300" simplePos="0" relativeHeight="251661312" behindDoc="0" locked="0" layoutInCell="1" allowOverlap="1">
             <wp:simplePos x="0" y="0"/>
-            <wp:positionH relativeFrom="page">
-              <wp:posOffset>3060065</wp:posOffset>
+            <wp:positionH relativeFrom="column">
+              <wp:posOffset>2611755</wp:posOffset>
             </wp:positionH>
             <wp:positionV relativeFrom="paragraph">
-              <wp:posOffset>264795</wp:posOffset>
+              <wp:posOffset>76835</wp:posOffset>
             </wp:positionV>
-            <wp:extent cx="3902710" cy="1304290"/>
+            <wp:extent cx="2741930" cy="1034415"/>
             <wp:effectExtent l="0" t="0" r="0" b="0"/>
             <wp:wrapNone/>
-            <wp:docPr id="5" name="Image 5"/>
-            <wp:cNvGraphicFramePr/>
+            <wp:docPr id="7" name="Picture 7" descr="editor-in-chief_Elkolind-removebg-preview"/>
+            <wp:cNvGraphicFramePr>
+              <a:graphicFrameLocks xmlns:a="http://schemas.openxmlformats.org/drawingml/2006/main" noChangeAspect="1"/>
+            </wp:cNvGraphicFramePr>
             <a:graphic xmlns:a="http://schemas.openxmlformats.org/drawingml/2006/main">
               <a:graphicData uri="http://schemas.openxmlformats.org/drawingml/2006/picture">
                 <pic:pic xmlns:pic="http://schemas.openxmlformats.org/drawingml/2006/picture">
                   <pic:nvPicPr>
-                    <pic:cNvPr id="5" name="Image 5"/>
-                    <pic:cNvPicPr/>
+                    <pic:cNvPr id="7" name="Picture 7" descr="editor-in-chief_Elkolind-removebg-preview"/>
+                    <pic:cNvPicPr>
+                      <a:picLocks noChangeAspect="1"/>
+                    </pic:cNvPicPr>
                   </pic:nvPicPr>
                   <pic:blipFill>
-                    <a:blip r:embed="rId7" cstate="print"/>
+                    <a:blip r:embed="rId7"/>
+                    <a:srcRect l="12045" r="14179" b="15791"/>
                     <a:stretch>
                       <a:fillRect/>
                     </a:stretch>
@@ -1067,7 +1069,7 @@
                   <pic:spPr>
                     <a:xfrm>
                       <a:off x="0" y="0"/>
-                      <a:ext cx="3902963" cy="1304544"/>
+                      <a:ext cx="2741930" cy="1034415"/>
                     </a:xfrm>
                     <a:prstGeom prst="rect">
                       <a:avLst/>
@@ -1079,70 +1081,39 @@
           </wp:anchor>
         </w:drawing>
       </w:r>
-      <w:r>
-        <w:t>Malang,</w:t>
-      </w:r>
-      <w:r>
-        <w:rPr>
-          <w:spacing w:val="-2"/>
-        </w:rPr>
-        <w:t xml:space="preserve"> </w:t>
-      </w:r>
-      <w:r>
-        <w:rPr>
-          <w:rFonts w:hint="default"/>
-          <w:lang w:val="en-US"/>
-        </w:rPr>
-        <w:t>{{loa_date}}</w:t>
-      </w:r>
+    </w:p>
+    <w:p>
+      <w:pPr>
+        <w:pStyle w:val="6"/>
+        <w:rPr>
+          <w:sz w:val="20"/>
+        </w:rPr>
+      </w:pPr>
+    </w:p>
+    <w:p>
+      <w:pPr>
+        <w:pStyle w:val="6"/>
+        <w:rPr>
+          <w:sz w:val="20"/>
+        </w:rPr>
+      </w:pPr>
       <w:bookmarkStart w:id="0" w:name="_GoBack"/>
       <w:bookmarkEnd w:id="0"/>
-      <w:r>
-        <w:rPr>
-          <w:rFonts w:hint="default"/>
-          <w:lang w:val="en-US"/>
-        </w:rPr>
-        <w:t xml:space="preserve"/>
-      </w:r>
-    </w:p>
-    <w:p>
-      <w:pPr>
-        <w:pStyle w:val="6"/>
+    </w:p>
+    <w:p>
+      <w:pPr>
+        <w:pStyle w:val="6"/>
+        <w:spacing w:before="66"/>
         <w:rPr>
           <w:sz w:val="20"/>
         </w:rPr>
       </w:pPr>
-    </w:p>
-    <w:p>
-      <w:pPr>
-        <w:pStyle w:val="6"/>
+      <w:r>
         <w:rPr>
           <w:sz w:val="20"/>
         </w:rPr>
-      </w:pPr>
-    </w:p>
-    <w:p>
-      <w:pPr>
-        <w:pStyle w:val="6"/>
-        <w:rPr>
-          <w:sz w:val="20"/>
-        </w:rPr>
-      </w:pPr>
-    </w:p>
-    <w:p>
-      <w:pPr>
-        <w:pStyle w:val="6"/>
-        <w:spacing w:before="66"/>
-        <w:rPr>
-          <w:sz w:val="20"/>
-        </w:rPr>
-      </w:pPr>
-      <w:r>
-        <w:rPr>
-          <w:sz w:val="20"/>
-        </w:rPr>
         <w:drawing>
-          <wp:anchor distT="0" distB="0" distL="0" distR="0" simplePos="0" relativeHeight="251661312" behindDoc="1" locked="0" layoutInCell="1" allowOverlap="1">
+          <wp:anchor distT="0" distB="0" distL="0" distR="0" simplePos="0" relativeHeight="251660288" behindDoc="1" locked="0" layoutInCell="1" allowOverlap="1">
             <wp:simplePos x="0" y="0"/>
             <wp:positionH relativeFrom="page">
               <wp:posOffset>1143000</wp:posOffset>

</xml_diff>